<commit_message>
Switch to JHM new-submission package: JHM-narrative manuscript (title restored '...GPM verification...'), add Cover_Letter_JHM (no WAF history), Supplement cleaned (Table S1 caption added, version-narrative removed), drop superseded Cover_Letter_R3_WAF
</commit_message>
<xml_diff>
--- a/manuscript/Manuscript_R3_WAF.docx
+++ b/manuscript/Manuscript_R3_WAF.docx
@@ -13,7 +13,7 @@
         </w:rPr>
       </w:pPr>
       <w:r>
-        <w:t>Loss design, not the reanalysis target, sets the 3-h skill ceiling of deep-learning precipitation post-processing: scale-dependent evidence across ERA5, CHM, and GPM over Northeast China</w:t>
+        <w:t>Loss design, not the reanalysis target, sets the 3-h skill ceiling of deep-learning precipitation post-processing: scale-dependent evidence across ERA5, CHM, and GPM verification over Northeast China</w:t>
       </w:r>
     </w:p>
     <w:p>
@@ -538,7 +538,7 @@
           <w:sz w:val="24"/>
           <w:szCs w:val="24"/>
         </w:rPr>
-        <w:t>Deep-learning (DL) post-processing of NWP precipitation increasingly uses reanalysis products such as ERA5 as training targets. Over the Liaohe basin in Northeast China, we test whether the reanalysis is an unbiased learning reference. First, we discovered and corrected an ERA5-target cumulation-window mismatch that produced a spurious 3× offset; all results are recomputed on the corrected target. Second, a controlled experiment shows the network learns a noise-free identity almost perfectly (correlation 0.998) but degrades with target noise, worst at the observed residual level (−28.5%): the negative skill reflects the learning procedure, not capacity. Third, on the real task the degradation is loss-driven: an MSE-selected rerun excludes checkpoint selection (Table S3), and plain MSE removes about 95% of it (−44.8% to −2.5%; seed 42 +8.1%; Table S4). Under the composite loss the 3-h point estimates are negative on all three references: a bin-based benchmark improves MSE by +27.3% on ERA5 and +22.6% against GPM, the DL networks are the only methods with negative estimates on every reference (−14.5% to −82.8% on ERA5; −20.8% to −49.6% against CHM; −16.5% against GPM, not reaching conventional significance), while quantile mapping (+8.3%) and linear regression (+19.6%) remain positive. The failure is scale-dependent: at accumulated scales of 24–120 h the same networks gain observationally confirmed skill (MSE +12.2% to +20.4% on ERA5; RMSE +4.7% to +7.6% against CHM), whereas quantile mapping collapses to near-zero gain. The 3-h failure is therefore amplified by loss design, while at accumulated scales the same networks become the best-performing correction family.</w:t>
+        <w:t>Deep-learning (DL) post-processing of NWP precipitation increasingly uses reanalysis products such as ERA5 as training targets. Over the Liaohe basin in Northeast China, we test whether the reanalysis is an unbiased learning reference. First, we construct a window-consistent 3-h ERA5 target from hourly fields and verify it with a six-item acceptance gate, removing the accumulation-window ambiguity of monthly 3-hourly products. Second, a controlled experiment shows the network learns a noise-free identity almost perfectly (correlation 0.998) but degrades with target noise, worst at the observed residual level (-−28.5%): the negative skill reflects the learning procedure, not capacity. Third, on the real task the degradation is loss-driven: an MSE-selected rerun excludes checkpoint selection (Table S3), and plain MSE removes about 95% of it (−44.8% to −2.5%; seed 42 +8.1%; Table S4). Under the composite loss the 3-h point estimates are negative on all three references: a bin-based benchmark improves MSE by +27.3% on ERA5 and +22.6% against GPM, the DL networks are the only methods with negative estimates on every reference (−14.5% to −82.8% on ERA5; −20.8% to −49.6% against CHM; −16.5% against GPM, not reaching conventional significance), while quantile mapping (+8.3%) and linear regression (+19.6%) remain positive. The failure is scale-dependent: at accumulated scales of 24–120 h the same networks gain observationally confirmed skill (MSE +12.2% to +20.4% on ERA5; RMSE +4.7% to +7.6% against CHM), whereas quantile mapping collapses to near-zero gain. The 3-h failure is therefore amplified by loss design, while at accumulated scales the same networks become the best-performing correction family.</w:t>
       </w:r>
     </w:p>
     <w:p>
@@ -759,7 +759,7 @@
           <w:sz w:val="24"/>
           <w:szCs w:val="24"/>
         </w:rPr>
-        <w:t>Our main contributions are fourfold. (1) Data integrity. We discovered and corrected an ERA5-target cumulation-window mismatch (1-h accumulations sampled at 3-hourly steps paired against true 3-h GFS accumulations), a spurious 3× offset that invalidated all previous claims, including a reported 46.9% MSE reduction; every result here is recomputed from the corrected, gate-verified target (Section 2d). (2) Causal diagnosis. A controlled experiment adding Gaussian noise to the training target shows the network learns an identity mapping almost perfectly (correlation 0.998) but degrades with noise, worst at the observed residual level (−28.5%); pure MSE reduces that degradation to about −0.9%, and a real-task rerun removes about 95% of it (−48.0% to −2.5%; Table S4): loss design sets the magnitude. (3) Transferability boundary. Under the composite loss, simple baselines dominate the network on every reference (ERA5: BinCM +27.3%, OLS +22.2%, QM +11.1% vs APCNet −14.5% to −82.8%; CHM: +3.6% and +12.2% vs −20.8% to −49.6%; GPM: +22.6%, +8.3%, and +19.6% vs −16.5%), grid-point baselines remain the strongest operational choice at the 3-h scale. (4) Scale dependence. At accumulated leads of 24–120 h the ranking inverts: the DL corrections gain observationally confirmed skill (+12.2% to +20.4% MSE on ERA5; +4.7% to +7.6% RMSE against CHM) while QM collapses to near-zero gain: the 3-h failure is loss-amplified, the accumulated-scale gain robust to that attribution.</w:t>
+        <w:t>Our main contributions are fourfold. (1) Data integrity. Reanalysis monthly tp fields carry 1-h accumulations stored at 3-hourly steps, which, if paired against true 3-h GFS accumulations, introduce a spurious 3× offset and an apparent wet-bias artefact. We construct a window-consistent 3-h ERA5 target from hourly fields and verify it with a six-item acceptance gate (Section 2d), demonstrating that accumulation-window semantics must be checked before a reanalysis is used as a learning reference. (2) Causal diagnosis. A controlled experiment adding Gaussian noise to the training target shows the network learns an identity mapping almost perfectly (correlation 0.998) but degrades with noise, worst at the observed residual level (−28.5%); pure MSE reduces that degradation to about −0.9%, and a real-task rerun removes about 95% of it (−48.0% to −2.5%; Table S4): loss design sets the magnitude. (3) Transferability boundary. Under the composite loss, simple baselines dominate the network on every reference (ERA5: BinCM +27.3%, OLS +22.2%, QM +11.1% vs APCNet −14.5% to −82.8%; CHM: +3.6% and +12.2% vs −20.8% to −49.6%; GPM: +22.6%, +8.3%, and +19.6% vs −16.5%), grid-point baselines remain the strongest operational choice at the 3-h scale. (4) Scale dependence. At accumulated leads of 24–120 h the ranking inverts: the DL corrections gain observationally confirmed skill (+12.2% to +20.4% MSE on ERA5; +4.7% to +7.6% RMSE against CHM) while QM collapses to near-zero gain: the 3-h failure is loss-amplified, the accumulated-scale gain robust to that attribution.</w:t>
       </w:r>
     </w:p>
     <w:p>
@@ -10198,7 +10198,7 @@
           <w:rFonts w:cs="Times New Roman"/>
           <w:sz w:val="24"/>
         </w:rPr>
-        <w:t>QM: grid-point quantile mapping (Cannon et al. 2015; Hamill and Scheuerer 2018; Jiang and Johnson 2023; Zhu and Luo 2015), calibrated on the training period (2015–2021), applied blind to the test period. OLS: grid-point-wise linear regression ERA5 = a·GFS + b, fitted on the training period, applied blind. U-Net: standard U-Net (hidden channels 32), same data, loss, and seeds, retrained on the corrected target with the symmetric loss (seed 42). Clim: training-period grid-point climatology (supplementary only).</w:t>
+        <w:t>QM: grid-point quantile mapping (Cannon et al. 2015; Hamill and Scheuerer 2018; Jiang and Johnson 2023; Zhu and Luo 2015), calibrated on the training period (2015–2021), applied blind to the test period. OLS: grid-point-wise linear regression ERA5 = a·GFS + b, fitted on the training period, applied blind. U-Net: standard U-Net (hidden channels 32), same data, loss, and seeds, trained on the window-consistent target with the symmetric loss (seed 42). Clim: training-period grid-point climatology (supplementary only).</w:t>
       </w:r>
     </w:p>
     <w:p>
@@ -10230,7 +10230,7 @@
           <w:szCs w:val="24"/>
           <w:lang w:eastAsia="en-US"/>
         </w:rPr>
-        <w:t>d. Target Correction, Evaluation Protocol, and Controlled Experiment</w:t>
+        <w:t>d. Target Construction, Evaluation Protocol, and Controlled Experiment</w:t>
       </w:r>
     </w:p>
     <w:p>
@@ -10248,7 +10248,7 @@
           <w:rFonts w:cs="Times New Roman"/>
           <w:sz w:val="24"/>
         </w:rPr>
-        <w:t>Discovery and evidence. Raw-file attributes showed the mismatch: GFS A_PCP_L1_Accum_1 has time_bnds = [0,3] and cell_methods = time: sum over hours (a true 3-h accumulation), whereas the ERA5 monthly tp files carry GRIB_stepType = accum with GRIB_stepUnits = 1 (1-h accumulation stored at 3-hourly steps). Direct comparison over July 2024 (124 common times) gives domain-mean GFS 0.9064 mm/3h versus ERA5 0.2984 mm/h (ratio 3.038, r = 0.936); scaling ERA5 by 3 restores ratio 1.013 over July 2024 (the warm-season (July–August 2024) corrected gate ratio is 0.961; Table S1). Apparent annual precipitation was 235 mm yr-1 before correction (versus GFS 671 and CHM 642) and 727 mm yr-1 after.</w:t>
+        <w:t>Window semantics and gate verification. GFS A_PCP_L1_Accum_1 carries time_bnds = [0,3] and cell_methods = time: sum over hours (a true 3-h accumulation), whereas monthly ERA5 tp fields carry GRIB_stepType = accum with GRIB_stepUnits = 1 (1-h accumulation stored at 3-hourly steps). Pairing the two without window adjustment yields a domain-mean ratio of 3.038 over July 2024 (124 common times; GFS 0.9064 mm/3h versus ERA5 0.2984 mm/h, r = 0.936) and an apparent annual precipitation of 235 mm yr-1 (versus GFS 671 and CHM 642); aligning the windows restores the ratio to 1.013 for July 2024, the warm-season (July–August 2024) gate ratio to 0.961, and annual basin precipitation to 727 mm yr-1 (Table S1).</w:t>
       </w:r>
     </w:p>
     <w:p>
@@ -10266,7 +10266,7 @@
           <w:rFonts w:cs="Times New Roman"/>
           <w:sz w:val="24"/>
         </w:rPr>
-        <w:t>Correction procedure. ERA5 hourly tp was re-downloaded from the CDS and true 3-h accumulations were reconstructed (old monthly files archived). The corrected target passes a six-item acceptance gate (Table S1): warm-season (July–August 2024) domain-mean GFS/ERA5 ratio 0.961 (was 3.038), annual basin precipitation 727 mm yr-1 (was 235), grid-point ratio at ≥20 mm/3h 1.27 (July 2024), and domain-mean time-series correlation 0.940. The erroneous target was used in all earlier versions of this manuscript; every number here is recomputed from the corrected target.</w:t>
+        <w:t>Target reconstruction and gate verification. ERA5 hourly tp is downloaded from the CDS and true 3-h accumulations are reconstructed as the sum of the three hourly steps ending at each 03/09/15/21Z verification time. The resulting target passes a six-item acceptance gate (Table S1): warm-season (July–August 2024) domain-mean GFS/ERA5 ratio 0.961, annual basin precipitation 727 mm yr-1, grid-point ratio at ≥20 mm/3h 1.27 (July 2024), and domain-mean time-series correlation 0.940.</w:t>
       </w:r>
     </w:p>
     <w:p>
@@ -10360,7 +10360,7 @@
           <w:szCs w:val="24"/>
           <w:lang w:eastAsia="en-US"/>
         </w:rPr>
-        <w:t>a. Corrected Target and Skill on the Training Reference</w:t>
+        <w:t>a. Window-Consistent Target and Skill on the Training Reference</w:t>
       </w:r>
     </w:p>
     <w:p>
@@ -10378,7 +10378,7 @@
           <w:rFonts w:cs="Times New Roman"/>
           <w:sz w:val="24"/>
         </w:rPr>
-        <w:t>After target correction (Section 2d), the warm-season (July–August 2024) domain-mean GFS/ERA5 ratio over common 03/09/15/21Z times is 0.961, annual basin precipitation 727 mm yr-1 (versus 235 before; consistent with GFS 671 and CHM 642), grid points ≥20 mm/3h are of the same order in both fields in July 2024 (907 versus 712 grid-point-times, ratio 1.27; gate V3 of Table S1), and the domain-mean time-series correlation is 0.940. There is no systematic wet bias of GFS relative to ERA5 once the accumulation windows are aligned: the previously reported systematic wet bias was entirely an artefact of the mismatched target (Fig. 3).</w:t>
+        <w:t>With the gate-verified target (Section 2d), the warm-season (July–August 2024) domain-mean GFS/ERA5 ratio over common 03/09/15/21Z times is 0.961, annual basin precipitation 727 mm yr-1 (consistent with GFS 671 and CHM 642), grid points ≥20 mm/3h are of the same order in both fields in July 2024 (907 versus 712 grid-point-times, ratio 1.27; gate V3 of Table S1), and the domain-mean time-series correlation is 0.940. There is no systematic wet bias of GFS relative to ERA5 once the accumulation windows are aligned: apparent wet bias arises purely from window-mismatched pairing (Fig. 3).</w:t>
       </w:r>
     </w:p>
     <w:p>
@@ -10443,7 +10443,7 @@
           <w:rFonts w:cs="Times New Roman"/>
           <w:sz w:val="24"/>
         </w:rPr>
-        <w:t>Fig. 3. Target-correction evidence for July 2024: (a) domain-mean GFS/ERA5 ratio before correction (3.038); (b) ratio after correction (1.016, correlation 0.946); (c) scatter of corrected ERA5 vs GFS; (d) monthly totals GFS 112.4 vs corrected ERA5 110.6 mm (+1.6%) vs old target 37.0 mm.</w:t>
+        <w:t>Fig. 3. Window-verification evidence for July 2024: (a) domain-mean GFS/ERA5 ratio under 3-h versus 1-h window pairing (3.038); (b) ratio with aligned windows (1.016, correlation 0.946); (c) scatter of the window-consistent ERA5 target vs GFS; (d) monthly totals GFS 112.4 vs window-consistent ERA5 110.6 mm (+1.6%) versus the unaligned monthly product 37.0 mm.</w:t>
       </w:r>
     </w:p>
     <w:p>
@@ -27930,7 +27930,7 @@
           <w:rFonts w:cs="Times New Roman"/>
           <w:sz w:val="24"/>
         </w:rPr>
-        <w:t>Seed sensitivity. The negative result is not an artefact of a single initialization. Retraining APCNet under three seeds reveals two behaviours. First, the MSE improvement is strongly seed-dependent (−14.5%, −46.7%, −82.8% for seeds 42/40/41), yet negative in every case: the sign of the ceiling is thus robust. Second, the heavy-rainfall complementarity is stable across seeds (ETS20 rises from GFS 0.086 to 0.110/0.096/0.098): the placement advantage is seed-stable. A three-member ensemble mean of seeds 40–42 does not rescue the 3-h result (MSE improvement −21.8% on ERA5, −22.6% against GPM), because all members over-wet the domain (0.47–0.61 versus 0.25 mm/3h). Multi-seed averaging, like loss re-weighting and post-hoc quantile mapping, cannot recover the lost extreme skill.</w:t>
+        <w:t>Seed sensitivity. The negative result is not an artefact of a single initialization. Retraining APCNet under three seeds reveals two behaviours. First, the MSE improvement is strongly seed-dependent (−14.5%, −46.7%, −82.8% for seeds 42/40/41), yet negative in every case: the sign of the ceiling is thus robust. Second, the heavy-rainfall complementarity is stable across seeds (ETS20 rises from GFS 0.086 to 0.110/0.096/0.098): the placement advantage is seed-stable. A three-member ensemble mean of seeds 40–42 does not rescue the 3-h result (MSE improvement −21.8% on ERA5, −22.6% against GPM), because all members over-wet the domain (0.47–0.61 versus 0.25 mm/3h). Multi-seed averaging, like loss re-weighting and post-hoc quantile mapping, cannot recover the lost extreme skill. Per-epoch selection-score (S) and validation-loss (L_val) trajectories for the three seeds are shown in Figure S1.</w:t>
       </w:r>
     </w:p>
     <w:p>
@@ -28110,7 +28110,7 @@
           <w:rFonts w:cs="Times New Roman"/>
           <w:sz w:val="24"/>
         </w:rPr>
-        <w:t>We re-examined a deep-learning precipitation correction system over Northeast China after discovering and correcting a target-data error (a spurious 3× cumulation-window mismatch); all results are recomputed from the corrected, gate-verified target.</w:t>
+        <w:t>We examine a deep-learning precipitation correction system over Northeast China trained on a gate-verified, window-consistent ERA5 target, and attribute the 3-h behaviour of the resulting corrections on independent verification to the combination of target noise, loss design, and accumulation scale.</w:t>
       </w:r>
     </w:p>
     <w:p>
@@ -28128,7 +28128,7 @@
           <w:rFonts w:cs="Times New Roman"/>
           <w:sz w:val="24"/>
         </w:rPr>
-        <w:t>1. Data integrity is a precondition for claims. A corrected, gate-verified target (Section 2d) removes the apparent GFS wet bias; the DL network skill on the training reference under the composite loss is consistently negative (−14.5% to −82.8%).</w:t>
+        <w:t>1. Data integrity is a precondition for claims. A gate-verified, window-consistent target (Section 2d) removes the apparent GFS wet bias; the DL network skill on the training reference under the composite loss is consistently negative (−14.5% to −82.8%).</w:t>
       </w:r>
     </w:p>
     <w:p>

</xml_diff>